<commit_message>
Chart: stack green below orange and show idle gaps in the README example
- Stack upward bars from the bottom as fine (green), bulk (orange), then
  moved (blue); legend follows the same order
- fixtures/chart-demo: three writing sessions over two days with 4.5 h and
  17 h idle gaps; the README example is now rendered with -p 2
- Regenerate the other chart samples for the new stacking order

Co-Authored-By: Claude Opus 5.5 <noreply@anthropic.com>
</commit_message>
<xml_diff>
--- a/fixtures/chart-demo.docx
+++ b/fixtures/chart-demo.docx
@@ -606,729 +606,1099 @@
           <w:t xml:space="preserve">本研究では</w:t>
         </w:r>
       </w:ins>
-      <w:ins w:id="121" w:author="学生E" w:date="2026-06-10T01:21:19.457Z">
+      <w:ins w:id="121" w:author="学生E" w:date="2026-06-10T05:50:19.457Z">
         <w:r>
           <w:t xml:space="preserve">本研究の目的は、AIを活用した面接評価システムにおいて、受験者の口頭説明の論理性と一貫性を定量的に評価する新しい指標を提案することである。既存研究では主に音声認識精度やキーワード一致度に基づく評価が中心であったが、本</w:t>
         </w:r>
       </w:ins>
-      <w:ins w:id="122" w:author="学生E" w:date="2026-06-10T01:21:19.457Z">
+      <w:ins w:id="122" w:author="学生E" w:date="2026-06-10T05:50:19.457Z">
         <w:r>
           <w:t xml:space="preserve">研究ではそれに加えて、発話の時系列構造を考慮した意味的つながりの評価を導入する。具体的には、発話をセグメントに分割し、各セグメント間の意味的類似度を埋め込みベクトルにより算出したうえで、論理展開の自然さをスコア化する。</w:t>
         </w:r>
       </w:ins>
-      <w:del w:id="123" w:author="学生E" w:date="2026-06-10T01:21:39.457Z">
+      <w:del w:id="123" w:author="学生E" w:date="2026-06-10T05:50:39.457Z">
         <w:r>
           <w:delText xml:space="preserve">データ数の拡大や他分野への応用が考えられる。また、評価者による主観評価との整合性についても検討が必要である。特に、面接評価の場面では口頭での説明力を定量的に測ることが重要だと考えら</w:delText>
         </w:r>
       </w:del>
-      <w:ins w:id="124" w:author="学生E" w:date="2026-06-10T01:22:12.072Z">
+      <w:ins w:id="124" w:author="学生E" w:date="2026-06-10T05:51:12.072Z">
         <w:r>
           <w:t xml:space="preserve">検討が必要である。</w:t>
         </w:r>
       </w:ins>
-      <w:ins w:id="125" w:author="学生E" w:date="2026-06-10T01:22:57.237Z">
+      <w:ins w:id="125" w:author="学生E" w:date="2026-06-10T05:51:57.237Z">
         <w:r>
           <w:t xml:space="preserve">本研究では</w:t>
         </w:r>
       </w:ins>
-      <w:del w:id="126" w:author="学生E" w:date="2026-06-10T01:23:02.237Z">
+      <w:del w:id="126" w:author="学生E" w:date="2026-06-10T05:52:02.237Z">
         <w:r>
           <w:delText xml:space="preserve">れる。本研究では従来手法の課題を整理し新しい評価指標を提案する。実験の結果提案手法は既存手法と比較して高い精度を示した。今後の課題としてデータ数の拡大や他分野への応用が考えられる。また、評価者による主観評価との整合性につ</w:delText>
         </w:r>
       </w:del>
-      <w:ins w:id="127" w:author="学生E" w:date="2026-06-10T01:24:02.074Z">
+      <w:ins w:id="127" w:author="学生E" w:date="2026-06-10T05:53:02.074Z">
         <w:r>
           <w:t xml:space="preserve">今後の課題として</w:t>
         </w:r>
       </w:ins>
-      <w:ins w:id="128" w:author="学生E" w:date="2026-06-10T01:24:41.330Z">
+      <w:ins w:id="128" w:author="学生E" w:date="2026-06-10T05:53:41.330Z">
         <w:r>
           <w:t xml:space="preserve">従来手法の</w:t>
         </w:r>
       </w:ins>
-      <w:ins w:id="129" w:author="学生E" w:date="2026-06-10T01:25:27.205Z">
+      <w:ins w:id="129" w:author="学生E" w:date="2026-06-10T05:54:27.205Z">
         <w:r>
           <w:t xml:space="preserve">主観評価との</w:t>
         </w:r>
       </w:ins>
-      <w:ins w:id="130" w:author="学生E" w:date="2026-06-10T01:25:51.129Z">
+      <w:ins w:id="130" w:author="学生E" w:date="2026-06-10T05:54:51.129Z">
         <w:r>
           <w:t xml:space="preserve">既存手法と比較して</w:t>
         </w:r>
       </w:ins>
-      <w:ins w:id="131" w:author="学生E" w:date="2026-06-10T01:26:08.650Z">
-        <w:r>
-          <w:t xml:space="preserve">定量的に測ることが</w:t>
-        </w:r>
-      </w:ins>
-      <w:ins w:id="132" w:author="学生E" w:date="2026-06-10T01:26:33.854Z">
+      <w:ins w:id="131" w:author="学生E" w:date="2026-06-10T05:55:08.650Z">
+        <w:r>
+          <w:t xml:space="preserve">定量的に測ることが</w:t>
+        </w:r>
+      </w:ins>
+      <w:ins w:id="132" w:author="学生E" w:date="2026-06-10T05:55:33.854Z">
         <w:r>
           <w:t xml:space="preserve">評価者による</w:t>
         </w:r>
       </w:ins>
-      <w:ins w:id="133" w:author="学生E" w:date="2026-06-10T01:27:29.461Z">
+      <w:ins w:id="133" w:author="学生E" w:date="2026-06-10T05:56:29.461Z">
         <w:r>
           <w:t xml:space="preserve">提案する。</w:t>
         </w:r>
       </w:ins>
-      <w:ins w:id="134" w:author="学生E" w:date="2026-06-10T01:28:29.433Z">
+      <w:ins w:id="134" w:author="学生E" w:date="2026-06-10T05:57:29.433Z">
         <w:r>
           <w:t xml:space="preserve">検討が必要である。</w:t>
         </w:r>
       </w:ins>
-      <w:ins w:id="135" w:author="学生E" w:date="2026-06-10T01:29:15.223Z">
+      <w:ins w:id="135" w:author="学生E" w:date="2026-06-10T05:58:15.223Z">
         <w:r>
           <w:t xml:space="preserve">課題を整理し</w:t>
         </w:r>
       </w:ins>
-      <w:ins w:id="136" w:author="学生E" w:date="2026-06-10T01:29:54.445Z">
+      <w:ins w:id="136" w:author="学生E" w:date="2026-06-10T05:58:54.445Z">
         <w:r>
           <w:t xml:space="preserve">検討が必要である。</w:t>
         </w:r>
       </w:ins>
-      <w:del w:id="137" w:author="学生E" w:date="2026-06-10T01:29:59.445Z">
+      <w:del w:id="137" w:author="学生E" w:date="2026-06-10T05:58:59.445Z">
         <w:r>
           <w:delText xml:space="preserve">いても</w:delText>
         </w:r>
       </w:del>
-      <w:ins w:id="138" w:author="学生E" w:date="2026-06-10T01:31:11.447Z">
+      <w:ins w:id="138" w:author="学生E" w:date="2026-06-10T06:00:11.447Z">
         <w:r>
           <w:t xml:space="preserve">本研究では</w:t>
         </w:r>
       </w:ins>
-      <w:ins w:id="139" w:author="学生E" w:date="2026-06-10T01:32:08.782Z">
+      <w:ins w:id="139" w:author="学生E" w:date="2026-06-10T06:01:08.782Z">
         <w:r>
           <w:t xml:space="preserve">従来手法の</w:t>
         </w:r>
       </w:ins>
-      <w:ins w:id="140" w:author="学生E" w:date="2026-06-10T01:32:38.536Z">
+      <w:ins w:id="140" w:author="学生E" w:date="2026-06-10T06:01:38.536Z">
         <w:r>
           <w:t xml:space="preserve">提案手法は</w:t>
         </w:r>
       </w:ins>
-      <w:ins w:id="141" w:author="学生E" w:date="2026-06-10T01:33:42.124Z">
+      <w:ins w:id="141" w:author="学生E" w:date="2026-06-10T06:02:42.124Z">
         <w:r>
           <w:t xml:space="preserve">今後の課題として</w:t>
         </w:r>
       </w:ins>
-      <w:ins w:id="142" w:author="学生E" w:date="2026-06-10T01:34:01.739Z">
+      <w:ins w:id="142" w:author="学生E" w:date="2026-06-10T06:03:01.739Z">
         <w:r>
           <w:t xml:space="preserve">提案する。</w:t>
         </w:r>
       </w:ins>
-      <w:ins w:id="143" w:author="学生E" w:date="2026-06-10T01:34:20.279Z">
+      <w:ins w:id="143" w:author="学生E" w:date="2026-06-10T06:03:20.279Z">
         <w:r>
           <w:t xml:space="preserve">他分野への応用が</w:t>
         </w:r>
       </w:ins>
-      <w:ins w:id="144" w:author="学生E" w:date="2026-06-10T01:35:31.565Z">
+      <w:ins w:id="144" w:author="学生E" w:date="2026-06-10T06:04:31.565Z">
         <w:r>
           <w:t xml:space="preserve">実験の結果</w:t>
         </w:r>
       </w:ins>
-      <w:ins w:id="145" w:author="学生E" w:date="2026-06-10T01:35:46.830Z">
+      <w:ins w:id="145" w:author="学生E" w:date="2026-06-10T06:04:46.830Z">
         <w:r>
           <w:t xml:space="preserve">提案する。</w:t>
         </w:r>
       </w:ins>
-      <w:ins w:id="146" w:author="学生E" w:date="2026-06-10T01:36:08.293Z">
+      <w:ins w:id="146" w:author="学生E" w:date="2026-06-10T06:05:08.293Z">
         <w:r>
           <w:t xml:space="preserve">提案する。</w:t>
         </w:r>
       </w:ins>
-      <w:ins w:id="147" w:author="学生E" w:date="2026-06-10T01:36:54.443Z">
-        <w:r>
-          <w:t xml:space="preserve">定量的に測ることが</w:t>
-        </w:r>
-      </w:ins>
-      <w:ins w:id="148" w:author="学生E" w:date="2026-06-10T01:37:18.785Z">
+      <w:ins w:id="147" w:author="学生E" w:date="2026-06-10T06:05:54.443Z">
+        <w:r>
+          <w:t xml:space="preserve">定量的に測ることが</w:t>
+        </w:r>
+      </w:ins>
+      <w:ins w:id="148" w:author="学生E" w:date="2026-06-10T06:06:18.785Z">
         <w:r>
           <w:t xml:space="preserve">重要だと考えられる。</w:t>
         </w:r>
       </w:ins>
-      <w:ins w:id="149" w:author="学生E" w:date="2026-06-10T01:38:27.202Z">
+      <w:ins w:id="149" w:author="学生E" w:date="2026-06-10T06:07:27.202Z">
         <w:r>
           <w:t xml:space="preserve">提案手法は</w:t>
         </w:r>
       </w:ins>
-      <w:ins w:id="150" w:author="学生E" w:date="2026-06-10T01:39:24.222Z">
+      <w:ins w:id="150" w:author="学生E" w:date="2026-06-10T06:08:24.222Z">
         <w:r>
           <w:t xml:space="preserve">新しい評価指標を</w:t>
         </w:r>
       </w:ins>
-      <w:ins w:id="151" w:author="学生E" w:date="2026-06-10T01:40:17.874Z">
+      <w:ins w:id="151" w:author="学生E" w:date="2026-06-10T06:09:17.874Z">
         <w:r>
           <w:t xml:space="preserve">重要だと考えられる。</w:t>
         </w:r>
       </w:ins>
-      <w:ins w:id="152" w:author="学生E" w:date="2026-06-10T01:41:02.962Z">
+      <w:ins w:id="152" w:author="学生E" w:date="2026-06-10T06:10:02.962Z">
         <w:r>
           <w:t xml:space="preserve">提案する。</w:t>
         </w:r>
       </w:ins>
-      <w:del w:id="153" w:author="学生E" w:date="2026-06-10T01:41:07.962Z">
+      <w:del w:id="153" w:author="学生E" w:date="2026-06-10T06:10:07.962Z">
         <w:r>
           <w:delText xml:space="preserve">検討が必要である。特に、面接評価の場面では口頭での説明力を定量的に測る</w:delText>
         </w:r>
       </w:del>
-      <w:ins w:id="154" w:author="学生E" w:date="2026-06-10T01:42:11.535Z">
+      <w:ins w:id="154" w:author="学生E" w:date="2026-06-10T06:11:11.535Z">
         <w:r>
           <w:t xml:space="preserve">主観評価との</w:t>
         </w:r>
       </w:ins>
-      <w:ins w:id="155" w:author="学生E" w:date="2026-06-10T01:42:34.077Z">
+      <w:ins w:id="155" w:author="学生E" w:date="2026-06-10T06:11:34.077Z">
         <w:r>
           <w:t xml:space="preserve">特に、</w:t>
         </w:r>
       </w:ins>
-      <w:ins w:id="156" w:author="学生E" w:date="2026-06-10T01:43:03.105Z">
+      <w:ins w:id="156" w:author="学生E" w:date="2026-06-10T06:12:03.105Z">
         <w:r>
           <w:t xml:space="preserve">面接評価の場面では</w:t>
         </w:r>
       </w:ins>
-      <w:ins w:id="157" w:author="学生E" w:date="2026-06-10T01:44:11.454Z">
-        <w:r>
-          <w:t xml:space="preserve">また、</w:t>
-        </w:r>
-      </w:ins>
-      <w:ins w:id="158" w:author="学生E" w:date="2026-06-10T01:45:04.984Z">
+      <w:ins w:id="157" w:author="学生E" w:date="2026-06-10T06:13:11.454Z">
+        <w:r>
+          <w:t xml:space="preserve">また、</w:t>
+        </w:r>
+      </w:ins>
+      <w:ins w:id="158" w:author="学生E" w:date="2026-06-10T06:14:04.984Z">
         <w:r>
           <w:t xml:space="preserve">整合性についても</w:t>
         </w:r>
       </w:ins>
-      <w:ins w:id="159" w:author="学生E" w:date="2026-06-10T01:45:20.557Z">
+      <w:ins w:id="159" w:author="学生E" w:date="2026-06-10T06:14:20.557Z">
         <w:r>
           <w:t xml:space="preserve">提案手法は</w:t>
         </w:r>
       </w:ins>
-      <w:ins w:id="160" w:author="学生E" w:date="2026-06-10T01:46:11.864Z">
-        <w:r>
-          <w:t xml:space="preserve">定量的に測ることが</w:t>
-        </w:r>
-      </w:ins>
-      <w:ins w:id="161" w:author="学生E" w:date="2026-06-10T01:46:38.810Z">
+      <w:ins w:id="160" w:author="学生E" w:date="2026-06-10T06:15:11.864Z">
+        <w:r>
+          <w:t xml:space="preserve">定量的に測ることが</w:t>
+        </w:r>
+      </w:ins>
+      <w:ins w:id="161" w:author="学生E" w:date="2026-06-10T06:15:38.810Z">
         <w:r>
           <w:t xml:space="preserve">整合性についても</w:t>
         </w:r>
       </w:ins>
-      <w:ins w:id="162" w:author="学生E" w:date="2026-06-10T01:47:05.745Z">
+      <w:ins w:id="162" w:author="学生E" w:date="2026-06-10T06:16:05.745Z">
         <w:r>
           <w:t xml:space="preserve">面接評価の場面では</w:t>
         </w:r>
       </w:ins>
-      <w:ins w:id="163" w:author="学生E" w:date="2026-06-10T01:47:25.720Z">
+      <w:ins w:id="163" w:author="学生E" w:date="2026-06-10T06:16:25.720Z">
         <w:r>
           <w:t xml:space="preserve">提案手法は</w:t>
         </w:r>
       </w:ins>
-      <w:ins w:id="164" w:author="学生E" w:date="2026-06-10T01:48:38.660Z">
+      <w:ins w:id="164" w:author="学生E" w:date="2026-06-10T06:17:38.660Z">
         <w:r>
           <w:t xml:space="preserve">新しい評価指標を</w:t>
         </w:r>
       </w:ins>
-      <w:ins w:id="165" w:author="学生E" w:date="2026-06-10T01:48:59.363Z">
+      <w:ins w:id="165" w:author="学生E" w:date="2026-06-10T06:17:59.363Z">
         <w:r>
           <w:t xml:space="preserve">検討が必要である。</w:t>
         </w:r>
       </w:ins>
-      <w:ins w:id="166" w:author="学生E" w:date="2026-06-10T01:49:35.469Z">
+      <w:ins w:id="166" w:author="学生E" w:date="2026-06-10T06:18:35.469Z">
         <w:r>
           <w:t xml:space="preserve">課題を整理し</w:t>
         </w:r>
       </w:ins>
-      <w:ins w:id="167" w:author="学生E" w:date="2026-06-10T01:50:11.477Z">
+      <w:ins w:id="167" w:author="学生E" w:date="2026-06-10T06:19:11.477Z">
         <w:r>
           <w:t xml:space="preserve">主観評価との</w:t>
         </w:r>
       </w:ins>
-      <w:ins w:id="168" w:author="学生E" w:date="2026-06-10T01:50:44.371Z">
-        <w:r>
-          <w:t xml:space="preserve">また、</w:t>
-        </w:r>
-      </w:ins>
-      <w:ins w:id="169" w:author="学生E" w:date="2026-06-10T01:51:36.812Z">
+      <w:ins w:id="168" w:author="学生E" w:date="2026-06-10T06:19:44.371Z">
+        <w:r>
+          <w:t xml:space="preserve">また、</w:t>
+        </w:r>
+      </w:ins>
+      <w:ins w:id="169" w:author="学生E" w:date="2026-06-10T06:20:36.812Z">
         <w:r>
           <w:t xml:space="preserve">提案する。</w:t>
         </w:r>
       </w:ins>
-      <w:ins w:id="170" w:author="学生E" w:date="2026-06-10T01:52:32.532Z">
+      <w:ins w:id="170" w:author="学生E" w:date="2026-06-10T06:21:32.532Z">
         <w:r>
           <w:t xml:space="preserve">既存手法と比較して</w:t>
         </w:r>
       </w:ins>
-      <w:ins w:id="171" w:author="学生E" w:date="2026-06-10T01:53:39.765Z">
+      <w:ins w:id="171" w:author="学生E" w:date="2026-06-10T06:22:39.765Z">
         <w:r>
           <w:t xml:space="preserve">提案する。</w:t>
         </w:r>
       </w:ins>
-      <w:del w:id="172" w:author="学生E" w:date="2026-06-10T01:53:44.765Z">
+      <w:del w:id="172" w:author="学生E" w:date="2026-06-10T06:22:44.765Z">
         <w:r>
           <w:delText xml:space="preserve">ことが重要だと考えら</w:delText>
         </w:r>
       </w:del>
-      <w:ins w:id="173" w:author="学生E" w:date="2026-06-10T01:54:09.489Z">
+      <w:ins w:id="173" w:author="学生E" w:date="2026-06-10T06:23:09.489Z">
         <w:r>
           <w:t xml:space="preserve">整合性についても</w:t>
         </w:r>
       </w:ins>
-      <w:ins w:id="174" w:author="学生E" w:date="2026-06-10T01:55:16.506Z">
+      <w:ins w:id="174" w:author="学生E" w:date="2026-06-10T06:24:16.506Z">
         <w:r>
           <w:t xml:space="preserve">面接評価の場面では</w:t>
         </w:r>
       </w:ins>
-      <w:ins w:id="175" w:author="学生E" w:date="2026-06-10T01:56:17.125Z">
+      <w:ins w:id="175" w:author="学生E" w:date="2026-06-10T06:25:17.125Z">
         <w:r>
           <w:t xml:space="preserve">従来手法の</w:t>
         </w:r>
       </w:ins>
-      <w:del w:id="176" w:author="学生E" w:date="2026-06-10T01:56:22.125Z">
+      <w:del w:id="176" w:author="学生E" w:date="2026-06-10T06:25:22.125Z">
         <w:r>
           <w:delText xml:space="preserve">れる。本研究では従来手法の課題を整理し新しい評価指標を提案する。実験の結果提案手法は既存手法と比較して高い精度を示した。</w:delText>
         </w:r>
       </w:del>
-      <w:ins w:id="177" w:author="学生E" w:date="2026-06-10T01:56:41.754Z">
+      <w:ins w:id="177" w:author="学生E" w:date="2026-06-10T06:25:41.754Z">
         <w:r>
           <w:t xml:space="preserve">データ数の拡大や</w:t>
         </w:r>
       </w:ins>
-      <w:del w:id="178" w:author="学生E" w:date="2026-06-10T01:56:46.754Z">
+      <w:del w:id="178" w:author="学生E" w:date="2026-06-10T06:25:46.754Z">
         <w:r>
           <w:delText xml:space="preserve">今後の課題としてデータ数の拡大や他分野への応用が考えられる。また、評価</w:delText>
         </w:r>
       </w:del>
-      <w:ins w:id="179" w:author="学生E" w:date="2026-06-10T01:57:19.042Z">
-        <w:r>
-          <w:t xml:space="preserve">定量的に測ることが</w:t>
-        </w:r>
-      </w:ins>
-      <w:ins w:id="180" w:author="学生E" w:date="2026-06-10T01:58:33.863Z">
+      <w:ins w:id="179" w:author="学生E" w:date="2026-06-10T06:26:19.042Z">
+        <w:r>
+          <w:t xml:space="preserve">定量的に測ることが</w:t>
+        </w:r>
+      </w:ins>
+      <w:ins w:id="180" w:author="学生E" w:date="2026-06-10T06:27:33.863Z">
         <w:r>
           <w:t xml:space="preserve">既存手法と比較して</w:t>
         </w:r>
       </w:ins>
-      <w:del w:id="181" w:author="学生E" w:date="2026-06-10T01:58:38.863Z">
+      <w:del w:id="181" w:author="学生E" w:date="2026-06-10T06:27:38.863Z">
         <w:r>
           <w:delText xml:space="preserve">者による主観評価との整合性についても検討が必要である。特に、面接評価の</w:delText>
         </w:r>
       </w:del>
-      <w:ins w:id="182" w:author="学生E" w:date="2026-06-10T01:59:42.186Z">
+      <w:ins w:id="182" w:author="学生E" w:date="2026-06-10T06:28:42.186Z">
         <w:r>
           <w:t xml:space="preserve">考えられる。</w:t>
         </w:r>
       </w:ins>
-      <w:ins w:id="183" w:author="学生E" w:date="2026-06-10T02:00:43.914Z">
+      <w:ins w:id="183" w:author="学生E" w:date="2026-06-10T06:29:43.914Z">
         <w:r>
           <w:t xml:space="preserve">データ数の拡大や</w:t>
         </w:r>
       </w:ins>
-      <w:ins w:id="184" w:author="学生E" w:date="2026-06-10T02:01:40.285Z">
+      <w:ins w:id="184" w:author="学生E" w:date="2026-06-10T06:30:40.285Z">
         <w:r>
           <w:t xml:space="preserve">高い精度を示した。</w:t>
         </w:r>
       </w:ins>
-      <w:ins w:id="185" w:author="学生E" w:date="2026-06-10T02:02:08.227Z">
+      <w:ins w:id="185" w:author="学生E" w:date="2026-06-10T06:31:08.227Z">
         <w:r>
           <w:t xml:space="preserve">整合性についても</w:t>
         </w:r>
       </w:ins>
-      <w:ins w:id="186" w:author="学生E" w:date="2026-06-10T02:03:10.520Z">
+      <w:ins w:id="186" w:author="学生E" w:date="2026-06-10T06:32:10.520Z">
         <w:r>
           <w:t xml:space="preserve">面接評価の場面では</w:t>
         </w:r>
       </w:ins>
-      <w:ins w:id="187" w:author="学生E" w:date="2026-06-10T02:03:38.505Z">
+      <w:ins w:id="187" w:author="学生E" w:date="2026-06-10T06:32:38.505Z">
         <w:r>
           <w:t xml:space="preserve">口頭での説明力を</w:t>
         </w:r>
       </w:ins>
-      <w:del w:id="188" w:author="学生E" w:date="2026-06-10T02:03:43.505Z">
+      <w:del w:id="188" w:author="学生E" w:date="2026-06-10T06:32:43.505Z">
         <w:r>
           <w:delText xml:space="preserve">場面では口頭での説明力を定量的に測ることが重要だと考えられる。本研究では従来手法の課題を整理し新しい評価指標を提案する。</w:delText>
         </w:r>
       </w:del>
-      <w:ins w:id="189" w:author="学生E" w:date="2026-06-10T02:04:39.209Z">
+      <w:ins w:id="189" w:author="学生E" w:date="2026-06-10T06:33:39.209Z">
         <w:r>
           <w:t xml:space="preserve">従来手法の</w:t>
         </w:r>
       </w:ins>
-      <w:ins w:id="190" w:author="学生E" w:date="2026-06-10T02:05:43.762Z">
+      <w:ins w:id="190" w:author="学生E" w:date="2026-06-10T06:34:43.762Z">
         <w:r>
           <w:t xml:space="preserve">口頭での説明力を</w:t>
         </w:r>
       </w:ins>
-      <w:ins w:id="191" w:author="学生E" w:date="2026-06-10T02:06:33.373Z">
+      <w:ins w:id="191" w:author="学生E" w:date="2026-06-10T06:35:33.373Z">
         <w:r>
           <w:t xml:space="preserve">実験の結果</w:t>
         </w:r>
       </w:ins>
-      <w:ins w:id="192" w:author="学生E" w:date="2026-06-10T02:07:42.307Z">
+      <w:ins w:id="192" w:author="学生E" w:date="2026-06-10T06:36:42.307Z">
         <w:r>
           <w:t xml:space="preserve">新しい評価指標を</w:t>
         </w:r>
       </w:ins>
-      <w:ins w:id="193" w:author="学生E" w:date="2026-06-10T02:08:14.251Z">
+      <w:ins w:id="193" w:author="学生E" w:date="2026-06-10T06:37:14.251Z">
         <w:r>
           <w:t xml:space="preserve">考えられる。</w:t>
         </w:r>
       </w:ins>
-      <w:ins w:id="194" w:author="学生E" w:date="2026-06-10T02:09:26.788Z">
+      <w:ins w:id="194" w:author="学生E" w:date="2026-06-10T06:38:26.788Z">
         <w:r>
           <w:t xml:space="preserve">提案手法は</w:t>
         </w:r>
       </w:ins>
-      <w:ins w:id="195" w:author="学生E" w:date="2026-06-10T02:10:06.745Z">
+      <w:ins w:id="195" w:author="学生E" w:date="2026-06-10T06:39:06.745Z">
         <w:r>
           <w:t xml:space="preserve">考えられる。</w:t>
         </w:r>
       </w:ins>
-      <w:ins w:id="196" w:author="学生E" w:date="2026-06-10T02:11:07.491Z">
+      <w:ins w:id="196" w:author="学生E" w:date="2026-06-10T06:40:07.491Z">
         <w:r>
           <w:t xml:space="preserve">新しい評価指標を</w:t>
         </w:r>
       </w:ins>
-      <w:ins w:id="197" w:author="学生E" w:date="2026-06-10T02:11:34.161Z">
+      <w:ins w:id="197" w:author="学生E" w:date="2026-06-10T06:40:34.161Z">
         <w:r>
           <w:t xml:space="preserve">重要だと考えられる。</w:t>
         </w:r>
       </w:ins>
-      <w:ins w:id="198" w:author="学生E" w:date="2026-06-10T02:12:36.932Z">
+      <w:ins w:id="198" w:author="学生E" w:date="2026-06-10T06:41:36.932Z">
         <w:r>
           <w:t xml:space="preserve">今後の課題として</w:t>
         </w:r>
       </w:ins>
-      <w:ins w:id="199" w:author="学生E" w:date="2026-06-10T02:13:11.749Z">
+      <w:ins w:id="199" w:author="学生E" w:date="2026-06-10T06:42:11.749Z">
         <w:r>
           <w:t xml:space="preserve">データ数の拡大や</w:t>
         </w:r>
       </w:ins>
-      <w:ins w:id="200" w:author="学生E" w:date="2026-06-10T02:13:59.565Z">
-        <w:r>
-          <w:t xml:space="preserve">また、</w:t>
-        </w:r>
-      </w:ins>
-      <w:ins w:id="201" w:author="学生E" w:date="2026-06-10T02:14:19.966Z">
+      <w:ins w:id="200" w:author="学生E" w:date="2026-06-10T06:42:59.565Z">
+        <w:r>
+          <w:t xml:space="preserve">また、</w:t>
+        </w:r>
+      </w:ins>
+      <w:ins w:id="201" w:author="学生E" w:date="2026-06-10T06:43:19.966Z">
         <w:r>
           <w:t xml:space="preserve">他分野への応用が</w:t>
         </w:r>
       </w:ins>
-      <w:ins w:id="202" w:author="学生E" w:date="2026-06-10T02:14:55.890Z">
+      <w:ins w:id="202" w:author="学生E" w:date="2026-06-10T06:43:55.890Z">
         <w:r>
           <w:t xml:space="preserve">評価者による</w:t>
         </w:r>
       </w:ins>
-      <w:ins w:id="203" w:author="学生E" w:date="2026-06-10T02:16:02.306Z">
+      <w:ins w:id="203" w:author="学生E" w:date="2026-06-10T06:45:02.306Z">
         <w:r>
           <w:t xml:space="preserve">口頭での説明力を</w:t>
         </w:r>
       </w:ins>
-      <w:ins w:id="204" w:author="学生E" w:date="2026-06-10T02:17:04.063Z">
+      <w:ins w:id="204" w:author="学生E" w:date="2026-06-10T06:46:04.063Z">
         <w:r>
           <w:t xml:space="preserve">課題を整理し</w:t>
         </w:r>
       </w:ins>
-      <w:ins w:id="205" w:author="学生E" w:date="2026-06-10T02:17:44.710Z">
+      <w:ins w:id="205" w:author="学生E" w:date="2026-06-10T06:46:44.710Z">
         <w:r>
           <w:t xml:space="preserve">既存手法と比較して</w:t>
         </w:r>
       </w:ins>
-      <w:ins w:id="206" w:author="学生E" w:date="2026-06-10T02:18:53.177Z">
+      <w:ins w:id="206" w:author="学生E" w:date="2026-06-10T06:47:53.177Z">
         <w:r>
           <w:t xml:space="preserve">主観評価との</w:t>
         </w:r>
       </w:ins>
-      <w:ins w:id="207" w:author="学生E" w:date="2026-06-10T02:19:30.623Z">
+      <w:ins w:id="207" w:author="学生E" w:date="2026-06-10T06:48:30.623Z">
         <w:r>
           <w:t xml:space="preserve">整合性についても</w:t>
         </w:r>
       </w:ins>
-      <w:ins w:id="208" w:author="学生E" w:date="2026-06-10T02:20:05.649Z">
+      <w:ins w:id="208" w:author="学生E" w:date="2026-06-10T06:49:05.649Z">
         <w:r>
           <w:t xml:space="preserve">既存手法と比較して</w:t>
         </w:r>
       </w:ins>
-      <w:ins w:id="209" w:author="学生E" w:date="2026-06-10T02:20:58.912Z">
+      <w:ins w:id="209" w:author="学生E" w:date="2026-06-10T06:49:58.912Z">
         <w:r>
           <w:t xml:space="preserve">特に、</w:t>
         </w:r>
       </w:ins>
-      <w:ins w:id="210" w:author="学生E" w:date="2026-06-10T02:21:29.261Z">
+      <w:ins w:id="210" w:author="学生E" w:date="2026-06-10T06:50:29.261Z">
         <w:r>
           <w:t xml:space="preserve">データ数の拡大や</w:t>
         </w:r>
       </w:ins>
-      <w:ins w:id="211" w:author="学生E" w:date="2026-06-10T02:22:08.079Z">
+      <w:ins w:id="211" w:author="学生E" w:date="2026-06-10T06:51:08.079Z">
         <w:r>
           <w:t xml:space="preserve">実験の結果</w:t>
         </w:r>
       </w:ins>
-      <w:ins w:id="212" w:author="学生E" w:date="2026-06-10T02:22:55.801Z">
+      <w:ins w:id="212" w:author="学生E" w:date="2026-06-10T06:51:55.801Z">
         <w:r>
           <w:t xml:space="preserve">検討が必要である。</w:t>
         </w:r>
       </w:ins>
-      <w:ins w:id="213" w:author="学生E" w:date="2026-06-10T02:24:02.411Z">
+      <w:ins w:id="213" w:author="学生E" w:date="2026-06-10T06:53:02.411Z">
         <w:r>
           <w:t xml:space="preserve">従来手法の</w:t>
         </w:r>
       </w:ins>
-      <w:ins w:id="214" w:author="学生E" w:date="2026-06-10T02:25:04.922Z">
+      <w:ins w:id="214" w:author="学生E" w:date="2026-06-10T06:54:04.922Z">
         <w:r>
           <w:t xml:space="preserve">新しい評価指標を</w:t>
         </w:r>
       </w:ins>
-      <w:ins w:id="215" w:author="学生E" w:date="2026-06-10T02:26:18.201Z">
+      <w:ins w:id="215" w:author="学生E" w:date="2026-06-10T06:55:18.201Z">
         <w:r>
           <w:t xml:space="preserve">提案手法は</w:t>
         </w:r>
       </w:ins>
-      <w:ins w:id="216" w:author="学生E" w:date="2026-06-10T02:26:43.557Z">
+      <w:ins w:id="216" w:author="学生E" w:date="2026-06-10T06:55:43.557Z">
         <w:r>
           <w:t xml:space="preserve">考えられる。</w:t>
         </w:r>
       </w:ins>
-      <w:ins w:id="217" w:author="学生E" w:date="2026-06-10T02:27:43.095Z">
-        <w:r>
-          <w:t xml:space="preserve">また、</w:t>
-        </w:r>
-      </w:ins>
-      <w:ins w:id="218" w:author="学生E" w:date="2026-06-10T02:28:24.220Z">
+      <w:ins w:id="217" w:author="学生E" w:date="2026-06-10T06:56:43.095Z">
+        <w:r>
+          <w:t xml:space="preserve">また、</w:t>
+        </w:r>
+      </w:ins>
+      <w:ins w:id="218" w:author="学生E" w:date="2026-06-10T06:57:24.220Z">
         <w:r>
           <w:t xml:space="preserve">重要だと考えられる。</w:t>
         </w:r>
       </w:ins>
-      <w:ins w:id="219" w:author="学生E" w:date="2026-06-10T02:29:09.217Z">
+      <w:ins w:id="219" w:author="学生E" w:date="2026-06-10T06:58:09.217Z">
         <w:r>
           <w:t xml:space="preserve">データ数の拡大や</w:t>
         </w:r>
       </w:ins>
-      <w:ins w:id="220" w:author="学生E" w:date="2026-06-10T02:29:56.146Z">
+      <w:ins w:id="220" w:author="学生E" w:date="2026-06-10T06:58:56.146Z">
         <w:r>
           <w:t xml:space="preserve">高い精度を示した。</w:t>
         </w:r>
       </w:ins>
-      <w:ins w:id="221" w:author="学生E" w:date="2026-06-10T02:30:49.701Z">
-        <w:r>
-          <w:t xml:space="preserve">定量的に測ることが</w:t>
-        </w:r>
-      </w:ins>
-      <w:ins w:id="222" w:author="学生E" w:date="2026-06-10T02:31:26.919Z">
+      <w:ins w:id="221" w:author="学生E" w:date="2026-06-10T06:59:49.701Z">
+        <w:r>
+          <w:t xml:space="preserve">定量的に測ることが</w:t>
+        </w:r>
+      </w:ins>
+      <w:ins w:id="222" w:author="学生E" w:date="2026-06-10T07:00:26.919Z">
         <w:r>
           <w:t xml:space="preserve">提案する。</w:t>
         </w:r>
       </w:ins>
-      <w:ins w:id="223" w:author="学生E" w:date="2026-06-10T02:32:12.807Z">
+      <w:ins w:id="223" w:author="学生E" w:date="2026-06-10T07:01:12.807Z">
         <w:r>
           <w:t xml:space="preserve">整合性についても</w:t>
         </w:r>
       </w:ins>
-      <w:ins w:id="224" w:author="学生E" w:date="2026-06-10T02:33:24.203Z">
+      <w:ins w:id="224" w:author="学生E" w:date="2026-06-10T07:02:24.203Z">
         <w:r>
           <w:t xml:space="preserve">特に、</w:t>
         </w:r>
       </w:ins>
-      <w:ins w:id="225" w:author="学生E" w:date="2026-06-10T02:34:11.329Z">
+      <w:ins w:id="225" w:author="学生E" w:date="2026-06-10T07:03:11.329Z">
         <w:r>
           <w:t xml:space="preserve">既存手法と比較して</w:t>
         </w:r>
       </w:ins>
-      <w:ins w:id="226" w:author="学生E" w:date="2026-06-10T02:35:08.434Z">
+      <w:ins w:id="226" w:author="学生E" w:date="2026-06-10T07:04:08.434Z">
         <w:r>
           <w:t xml:space="preserve">新しい評価指標を</w:t>
         </w:r>
       </w:ins>
-      <w:ins w:id="227" w:author="学生E" w:date="2026-06-10T02:35:30.358Z">
+      <w:ins w:id="227" w:author="学生E" w:date="2026-06-10T07:04:30.358Z">
         <w:r>
           <w:t xml:space="preserve">高い精度を示した。</w:t>
         </w:r>
       </w:ins>
-      <w:ins w:id="228" w:author="学生E" w:date="2026-06-10T02:36:29.242Z">
+      <w:ins w:id="228" w:author="学生E" w:date="2026-06-10T07:05:29.242Z">
         <w:r>
           <w:t xml:space="preserve">従来手法の</w:t>
         </w:r>
       </w:ins>
-      <w:ins w:id="229" w:author="学生E" w:date="2026-06-10T02:37:02.062Z">
-        <w:r>
-          <w:t xml:space="preserve">定量的に測ることが</w:t>
-        </w:r>
-      </w:ins>
-      <w:ins w:id="230" w:author="学生E" w:date="2026-06-10T02:38:10.339Z">
+      <w:ins w:id="229" w:author="学生E" w:date="2026-06-10T07:06:02.062Z">
+        <w:r>
+          <w:t xml:space="preserve">定量的に測ることが</w:t>
+        </w:r>
+      </w:ins>
+      <w:ins w:id="230" w:author="学生E" w:date="2026-06-10T07:07:10.339Z">
         <w:r>
           <w:t xml:space="preserve">考えられる。</w:t>
         </w:r>
       </w:ins>
-      <w:ins w:id="231" w:author="学生E" w:date="2026-06-10T02:39:23.252Z">
+      <w:ins w:id="231" w:author="学生E" w:date="2026-06-10T07:08:23.252Z">
         <w:r>
           <w:t xml:space="preserve">検討が必要である。</w:t>
         </w:r>
       </w:ins>
-      <w:ins w:id="232" w:author="学生E" w:date="2026-06-10T02:40:12.035Z">
+      <w:ins w:id="232" w:author="学生E" w:date="2026-06-10T07:09:12.035Z">
         <w:r>
           <w:t xml:space="preserve">既存手法と比較して</w:t>
         </w:r>
       </w:ins>
-      <w:ins w:id="233" w:author="学生E" w:date="2026-06-10T02:41:22.381Z">
+      <w:ins w:id="233" w:author="学生E" w:date="2026-06-10T07:10:22.381Z">
         <w:r>
           <w:t xml:space="preserve">他分野への応用が</w:t>
         </w:r>
       </w:ins>
-      <w:ins w:id="234" w:author="学生E" w:date="2026-06-10T02:41:46.358Z">
+      <w:ins w:id="234" w:author="学生E" w:date="2026-06-10T07:10:46.358Z">
         <w:r>
           <w:t xml:space="preserve">検討が必要である。</w:t>
         </w:r>
       </w:ins>
-      <w:ins w:id="235" w:author="学生E" w:date="2026-06-10T02:42:57.384Z">
+      <w:ins w:id="235" w:author="学生E" w:date="2026-06-10T07:11:57.384Z">
         <w:r>
           <w:t xml:space="preserve">他分野への応用が</w:t>
         </w:r>
       </w:ins>
-      <w:ins w:id="236" w:author="学生E" w:date="2026-06-10T02:43:29.321Z">
+      <w:ins w:id="236" w:author="学生E" w:date="2026-06-10T07:12:29.321Z">
         <w:r>
           <w:t xml:space="preserve">他分野への応用が</w:t>
         </w:r>
       </w:ins>
-      <w:del w:id="237" w:author="学生E" w:date="2026-06-10T02:43:34.321Z">
+      <w:del w:id="237" w:author="学生E" w:date="2026-06-10T07:12:34.321Z">
         <w:r>
           <w:delText xml:space="preserve">実験の結果提案手法は既存手法と比較して高い精度を示した。今後の課題としてデータ数の拡大や他分野への応用が考えられる。また、評価者による主観評価との整合性についても検討が必要である。特に、面接評価の場面では口頭での説明力を</w:delText>
         </w:r>
       </w:del>
-      <w:ins w:id="238" w:author="学生E" w:date="2026-06-10T02:44:37.049Z">
+      <w:ins w:id="238" w:author="学生E" w:date="2026-06-10T07:13:37.049Z">
         <w:r>
           <w:t xml:space="preserve">新しい評価指標を</w:t>
         </w:r>
       </w:ins>
-      <w:ins w:id="239" w:author="学生E" w:date="2026-06-10T02:45:11.984Z">
-        <w:r>
-          <w:t xml:space="preserve">定量的に測ることが</w:t>
-        </w:r>
-      </w:ins>
-      <w:ins w:id="240" w:author="学生E" w:date="2026-06-10T02:45:34.583Z">
+      <w:ins w:id="239" w:author="学生E" w:date="2026-06-10T07:14:11.984Z">
+        <w:r>
+          <w:t xml:space="preserve">定量的に測ることが</w:t>
+        </w:r>
+      </w:ins>
+      <w:ins w:id="240" w:author="学生E" w:date="2026-06-10T07:14:34.583Z">
         <w:r>
           <w:t xml:space="preserve">高い精度を示した。</w:t>
         </w:r>
       </w:ins>
-      <w:ins w:id="241" w:author="学生E" w:date="2026-06-10T02:46:36.427Z">
+      <w:ins w:id="241" w:author="学生E" w:date="2026-06-10T07:15:36.427Z">
         <w:r>
           <w:t xml:space="preserve">評価者による</w:t>
         </w:r>
       </w:ins>
-      <w:ins w:id="242" w:author="学生E" w:date="2026-06-10T02:46:52.465Z">
+      <w:ins w:id="242" w:author="学生E" w:date="2026-06-10T07:15:52.465Z">
         <w:r>
           <w:t xml:space="preserve">本研究では</w:t>
         </w:r>
       </w:ins>
-      <w:ins w:id="243" w:author="学生E" w:date="2026-06-10T02:47:41.906Z">
+      <w:ins w:id="243" w:author="学生E" w:date="2026-06-10T07:16:41.906Z">
         <w:r>
           <w:t xml:space="preserve">実験の結果</w:t>
         </w:r>
       </w:ins>
-      <w:ins w:id="244" w:author="学生E" w:date="2026-06-10T02:48:06.014Z">
+      <w:ins w:id="244" w:author="学生E" w:date="2026-06-10T07:17:06.014Z">
         <w:r>
           <w:t xml:space="preserve">今後の課題として</w:t>
         </w:r>
       </w:ins>
-      <w:ins w:id="245" w:author="学生E" w:date="2026-06-10T02:48:27.291Z">
+      <w:ins w:id="245" w:author="学生E" w:date="2026-06-10T07:17:27.291Z">
         <w:r>
           <w:t xml:space="preserve">課題を整理し</w:t>
         </w:r>
       </w:ins>
-      <w:ins w:id="246" w:author="学生E" w:date="2026-06-10T02:49:27.564Z">
+      <w:ins w:id="246" w:author="学生E" w:date="2026-06-10T07:18:27.564Z">
         <w:r>
           <w:t xml:space="preserve">重要だと考えられる。</w:t>
         </w:r>
       </w:ins>
-      <w:del w:id="247" w:author="学生E" w:date="2026-06-10T02:49:32.564Z">
+      <w:del w:id="247" w:author="学生E" w:date="2026-06-10T07:18:32.564Z">
         <w:r>
           <w:delText xml:space="preserve">定量的に測ることが重要だと考えられる。</w:delText>
         </w:r>
       </w:del>
-      <w:ins w:id="248" w:author="学生E" w:date="2026-06-10T02:50:00.687Z">
+      <w:ins w:id="248" w:author="学生E" w:date="2026-06-10T07:19:00.687Z">
         <w:r>
           <w:t xml:space="preserve">考えられる。</w:t>
         </w:r>
       </w:ins>
-      <w:ins w:id="249" w:author="学生E" w:date="2026-06-10T02:50:51.489Z">
+      <w:ins w:id="249" w:author="学生E" w:date="2026-06-10T07:19:51.489Z">
         <w:r>
           <w:t xml:space="preserve">提案する。</w:t>
         </w:r>
       </w:ins>
-      <w:del w:id="250" w:author="学生E" w:date="2026-06-10T02:50:56.489Z">
+      <w:del w:id="250" w:author="学生E" w:date="2026-06-10T07:19:56.489Z">
         <w:r>
           <w:delText xml:space="preserve"/>
         </w:r>
       </w:del>
-      <w:ins w:id="251" w:author="学生E" w:date="2026-06-10T02:51:35.032Z">
+      <w:ins w:id="251" w:author="学生E" w:date="2026-06-10T07:20:35.032Z">
         <w:r>
           <w:t xml:space="preserve">面接評価の場面では</w:t>
         </w:r>
       </w:ins>
-      <w:ins w:id="252" w:author="学生E" w:date="2026-06-10T02:52:31.047Z">
+      <w:ins w:id="252" w:author="学生E" w:date="2026-06-10T07:21:31.047Z">
         <w:r>
           <w:t xml:space="preserve">提案手法は</w:t>
         </w:r>
       </w:ins>
-      <w:ins w:id="253" w:author="学生E" w:date="2026-06-10T02:53:26.366Z">
+      <w:ins w:id="253" w:author="学生E" w:date="2026-06-11T00:22:26.366Z">
         <w:r>
           <w:t xml:space="preserve">重要だと考えられる。</w:t>
         </w:r>
       </w:ins>
-      <w:ins w:id="254" w:author="学生E" w:date="2026-06-10T02:54:27.299Z">
+      <w:ins w:id="254" w:author="学生E" w:date="2026-06-11T00:23:27.299Z">
         <w:r>
           <w:t xml:space="preserve">面接評価の場面では</w:t>
         </w:r>
       </w:ins>
-      <w:ins w:id="255" w:author="学生E" w:date="2026-06-10T02:54:55.749Z">
+      <w:ins w:id="255" w:author="学生E" w:date="2026-06-11T00:23:55.749Z">
         <w:r>
           <w:t xml:space="preserve">評価者による</w:t>
         </w:r>
       </w:ins>
-      <w:ins w:id="256" w:author="学生E" w:date="2026-06-10T02:56:01.220Z">
+      <w:ins w:id="256" w:author="学生E" w:date="2026-06-11T00:25:01.220Z">
         <w:r>
           <w:t xml:space="preserve">他分野への応用が</w:t>
         </w:r>
       </w:ins>
-      <w:del w:id="257" w:author="学生E" w:date="2026-06-10T02:56:06.220Z">
+      <w:del w:id="257" w:author="学生E" w:date="2026-06-11T00:25:06.220Z">
         <w:r>
           <w:delText xml:space="preserve"/>
         </w:r>
       </w:del>
-      <w:ins w:id="258" w:author="学生E" w:date="2026-06-10T02:57:06.429Z">
+      <w:ins w:id="258" w:author="学生E" w:date="2026-06-11T00:26:06.429Z">
         <w:r>
           <w:t xml:space="preserve">整合性についても</w:t>
         </w:r>
       </w:ins>
-      <w:ins w:id="259" w:author="学生E" w:date="2026-06-10T02:58:14.496Z">
+      <w:ins w:id="259" w:author="学生E" w:date="2026-06-11T00:27:14.496Z">
         <w:r>
           <w:t xml:space="preserve">主観評価との</w:t>
         </w:r>
       </w:ins>
-      <w:del w:id="260" w:author="学生E" w:date="2026-06-10T02:58:19.496Z">
+      <w:del w:id="260" w:author="学生E" w:date="2026-06-11T00:27:19.496Z">
         <w:r>
           <w:delText xml:space="preserve"/>
         </w:r>
       </w:del>
-      <w:ins w:id="261" w:author="学生E" w:date="2026-06-10T02:58:58.133Z">
+      <w:ins w:id="261" w:author="学生E" w:date="2026-06-11T00:27:58.133Z">
         <w:r>
           <w:t xml:space="preserve">提案する。</w:t>
         </w:r>
       </w:ins>
-      <w:ins w:id="262" w:author="学生E" w:date="2026-06-10T03:00:08.751Z">
+      <w:ins w:id="262" w:author="学生E" w:date="2026-06-11T00:29:08.751Z">
         <w:r>
           <w:t xml:space="preserve">提案手法は</w:t>
         </w:r>
       </w:ins>
-      <w:ins w:id="263" w:author="学生E" w:date="2026-06-10T03:00:25.537Z">
+      <w:ins w:id="263" w:author="学生E" w:date="2026-06-11T00:29:25.537Z">
         <w:r>
           <w:t xml:space="preserve">面接評価の場面では</w:t>
         </w:r>
       </w:ins>
-      <w:del w:id="264" w:author="学生E" w:date="2026-06-10T03:00:30.537Z">
+      <w:del w:id="264" w:author="学生E" w:date="2026-06-11T00:29:30.537Z">
         <w:r>
           <w:delText xml:space="preserve"/>
         </w:r>
       </w:del>
-      <w:ins w:id="265" w:author="学生E" w:date="2026-06-10T03:00:52.838Z">
+      <w:ins w:id="265" w:author="学生E" w:date="2026-06-11T00:29:52.838Z">
         <w:r>
           <w:t xml:space="preserve">提案する。</w:t>
+        </w:r>
+      </w:ins>
+      <w:ins w:id="266" w:author="学生E" w:date="2026-06-11T00:30:36.277Z">
+        <w:r>
+          <w:t xml:space="preserve">定量的に測ることが</w:t>
+        </w:r>
+      </w:ins>
+      <w:ins w:id="267" w:author="学生E" w:date="2026-06-11T00:30:51.545Z">
+        <w:r>
+          <w:t xml:space="preserve">提案する。</w:t>
+        </w:r>
+      </w:ins>
+      <w:ins w:id="268" w:author="学生E" w:date="2026-06-11T00:32:03.621Z">
+        <w:r>
+          <w:t xml:space="preserve">今後の課題として</w:t>
+        </w:r>
+      </w:ins>
+      <w:ins w:id="269" w:author="学生E" w:date="2026-06-11T00:32:42.017Z">
+        <w:r>
+          <w:t xml:space="preserve">高い精度を示した。</w:t>
+        </w:r>
+      </w:ins>
+      <w:ins w:id="270" w:author="学生E" w:date="2026-06-11T00:32:59.160Z">
+        <w:r>
+          <w:t xml:space="preserve">既存手法と比較して</w:t>
+        </w:r>
+      </w:ins>
+      <w:ins w:id="271" w:author="学生E" w:date="2026-06-11T00:34:13.591Z">
+        <w:r>
+          <w:t xml:space="preserve">また、</w:t>
+        </w:r>
+      </w:ins>
+      <w:ins w:id="272" w:author="学生E" w:date="2026-06-11T00:35:18.101Z">
+        <w:r>
+          <w:t xml:space="preserve">特に、</w:t>
+        </w:r>
+      </w:ins>
+      <w:ins w:id="273" w:author="学生E" w:date="2026-06-11T00:36:31.337Z">
+        <w:r>
+          <w:t xml:space="preserve">新しい評価指標を</w:t>
+        </w:r>
+      </w:ins>
+      <w:ins w:id="274" w:author="学生E" w:date="2026-06-11T00:37:38.032Z">
+        <w:r>
+          <w:t xml:space="preserve">主観評価との</w:t>
+        </w:r>
+      </w:ins>
+      <w:ins w:id="275" w:author="学生E" w:date="2026-06-11T00:38:12.041Z">
+        <w:r>
+          <w:t xml:space="preserve">今後の課題として</w:t>
+        </w:r>
+      </w:ins>
+      <w:ins w:id="276" w:author="学生E" w:date="2026-06-11T00:38:54.885Z">
+        <w:r>
+          <w:t xml:space="preserve">また、</w:t>
+        </w:r>
+      </w:ins>
+      <w:ins w:id="277" w:author="学生E" w:date="2026-06-11T00:39:56.584Z">
+        <w:r>
+          <w:t xml:space="preserve">本研究では</w:t>
+        </w:r>
+      </w:ins>
+      <w:ins w:id="278" w:author="学生E" w:date="2026-06-11T00:40:17.589Z">
+        <w:r>
+          <w:t xml:space="preserve">主観評価との</w:t>
+        </w:r>
+      </w:ins>
+      <w:ins w:id="279" w:author="学生E" w:date="2026-06-11T00:41:18.724Z">
+        <w:r>
+          <w:t xml:space="preserve">新しい評価指標を</w:t>
+        </w:r>
+      </w:ins>
+      <w:ins w:id="280" w:author="学生E" w:date="2026-06-11T00:42:25.379Z">
+        <w:r>
+          <w:t xml:space="preserve">主観評価との</w:t>
+        </w:r>
+      </w:ins>
+      <w:ins w:id="281" w:author="学生E" w:date="2026-06-11T00:42:46.267Z">
+        <w:r>
+          <w:t xml:space="preserve">面接評価の場面では</w:t>
+        </w:r>
+      </w:ins>
+      <w:ins w:id="282" w:author="学生E" w:date="2026-06-11T00:43:42.071Z">
+        <w:r>
+          <w:t xml:space="preserve">課題を整理し</w:t>
+        </w:r>
+      </w:ins>
+      <w:ins w:id="283" w:author="学生E" w:date="2026-06-11T00:44:01.560Z">
+        <w:r>
+          <w:t xml:space="preserve">評価者による</w:t>
+        </w:r>
+      </w:ins>
+      <w:ins w:id="284" w:author="学生E" w:date="2026-06-11T00:44:20.429Z">
+        <w:r>
+          <w:t xml:space="preserve">高い精度を示した。</w:t>
+        </w:r>
+      </w:ins>
+      <w:ins w:id="285" w:author="学生E" w:date="2026-06-11T00:44:47.126Z">
+        <w:r>
+          <w:t xml:space="preserve">また、</w:t>
+        </w:r>
+      </w:ins>
+      <w:del w:id="286" w:author="学生E" w:date="2026-06-11T00:44:52.126Z">
+        <w:r>
+          <w:delText xml:space="preserve"/>
+        </w:r>
+      </w:del>
+      <w:ins w:id="287" w:author="学生E" w:date="2026-06-11T00:45:15.374Z">
+        <w:r>
+          <w:t xml:space="preserve">検討が必要である。</w:t>
+        </w:r>
+      </w:ins>
+      <w:ins w:id="288" w:author="学生E" w:date="2026-06-11T00:46:29.485Z">
+        <w:r>
+          <w:t xml:space="preserve">検討が必要である。</w:t>
+        </w:r>
+      </w:ins>
+      <w:del w:id="289" w:author="学生E" w:date="2026-06-11T00:46:34.485Z">
+        <w:r>
+          <w:delText xml:space="preserve"/>
+        </w:r>
+      </w:del>
+      <w:ins w:id="290" w:author="学生E" w:date="2026-06-11T00:46:50.810Z">
+        <w:r>
+          <w:t xml:space="preserve">既存手法と比較して</w:t>
+        </w:r>
+      </w:ins>
+      <w:ins w:id="291" w:author="学生E" w:date="2026-06-11T00:47:17.458Z">
+        <w:r>
+          <w:t xml:space="preserve">評価者による</w:t>
+        </w:r>
+      </w:ins>
+      <w:ins w:id="292" w:author="学生E" w:date="2026-06-11T00:47:52.473Z">
+        <w:r>
+          <w:t xml:space="preserve">評価者による</w:t>
+        </w:r>
+      </w:ins>
+      <w:del w:id="293" w:author="学生E" w:date="2026-06-11T00:47:57.473Z">
+        <w:r>
+          <w:delText xml:space="preserve"/>
+        </w:r>
+      </w:del>
+      <w:ins w:id="294" w:author="学生E" w:date="2026-06-11T00:48:48.679Z">
+        <w:r>
+          <w:t xml:space="preserve">定量的に測ることが</w:t>
+        </w:r>
+      </w:ins>
+      <w:ins w:id="295" w:author="学生E" w:date="2026-06-11T00:50:01.699Z">
+        <w:r>
+          <w:t xml:space="preserve">口頭での説明力を</w:t>
+        </w:r>
+      </w:ins>
+      <w:ins w:id="296" w:author="学生E" w:date="2026-06-11T00:50:48.695Z">
+        <w:r>
+          <w:t xml:space="preserve">口頭での説明力を</w:t>
+        </w:r>
+      </w:ins>
+      <w:ins w:id="297" w:author="学生E" w:date="2026-06-11T00:51:38.221Z">
+        <w:r>
+          <w:t xml:space="preserve">課題を整理し</w:t>
+        </w:r>
+      </w:ins>
+      <w:ins w:id="298" w:author="学生E" w:date="2026-06-11T00:52:00.779Z">
+        <w:r>
+          <w:t xml:space="preserve">新しい評価指標を</w:t>
+        </w:r>
+      </w:ins>
+      <w:ins w:id="299" w:author="学生E" w:date="2026-06-11T00:52:51.792Z">
+        <w:r>
+          <w:t xml:space="preserve">特に、</w:t>
+        </w:r>
+      </w:ins>
+      <w:del w:id="300" w:author="学生E" w:date="2026-06-11T00:52:56.792Z">
+        <w:r>
+          <w:delText xml:space="preserve"/>
+        </w:r>
+      </w:del>
+      <w:ins w:id="301" w:author="学生E" w:date="2026-06-11T00:53:45.771Z">
+        <w:r>
+          <w:t xml:space="preserve">今後の課題として</w:t>
+        </w:r>
+      </w:ins>
+      <w:ins w:id="302" w:author="学生E" w:date="2026-06-11T00:54:18.068Z">
+        <w:r>
+          <w:t xml:space="preserve">実験の結果</w:t>
+        </w:r>
+      </w:ins>
+      <w:ins w:id="303" w:author="学生E" w:date="2026-06-11T00:55:15.078Z">
+        <w:r>
+          <w:t xml:space="preserve">考えられる。</w:t>
+        </w:r>
+      </w:ins>
+      <w:ins w:id="304" w:author="学生E" w:date="2026-06-11T00:56:15.993Z">
+        <w:r>
+          <w:t xml:space="preserve">検討が必要である。</w:t>
+        </w:r>
+      </w:ins>
+      <w:del w:id="305" w:author="学生E" w:date="2026-06-11T00:56:20.993Z">
+        <w:r>
+          <w:delText xml:space="preserve"/>
+        </w:r>
+      </w:del>
+      <w:ins w:id="306" w:author="学生E" w:date="2026-06-11T00:57:09.177Z">
+        <w:r>
+          <w:t xml:space="preserve">考えられる。</w:t>
+        </w:r>
+      </w:ins>
+      <w:ins w:id="307" w:author="学生E" w:date="2026-06-11T00:57:53.327Z">
+        <w:r>
+          <w:t xml:space="preserve">定量的に測ることが</w:t>
+        </w:r>
+      </w:ins>
+      <w:ins w:id="308" w:author="学生E" w:date="2026-06-11T00:58:52.547Z">
+        <w:r>
+          <w:t xml:space="preserve">評価者による</w:t>
+        </w:r>
+      </w:ins>
+      <w:ins w:id="309" w:author="学生E" w:date="2026-06-11T00:59:44.738Z">
+        <w:r>
+          <w:t xml:space="preserve">重要だと考えられる。</w:t>
+        </w:r>
+      </w:ins>
+      <w:ins w:id="310" w:author="学生E" w:date="2026-06-11T01:00:40.502Z">
+        <w:r>
+          <w:t xml:space="preserve">新しい評価指標を</w:t>
+        </w:r>
+      </w:ins>
+      <w:ins w:id="311" w:author="学生E" w:date="2026-06-11T01:01:35.265Z">
+        <w:r>
+          <w:t xml:space="preserve">新しい評価指標を</w:t>
+        </w:r>
+      </w:ins>
+      <w:ins w:id="312" w:author="学生E" w:date="2026-06-11T01:02:47.935Z">
+        <w:r>
+          <w:t xml:space="preserve">従来手法の</w:t>
+        </w:r>
+      </w:ins>
+      <w:ins w:id="313" w:author="学生E" w:date="2026-06-11T01:04:00.050Z">
+        <w:r>
+          <w:t xml:space="preserve">重要だと考えられる。</w:t>
+        </w:r>
+      </w:ins>
+      <w:ins w:id="314" w:author="学生E" w:date="2026-06-11T01:04:24.419Z">
+        <w:r>
+          <w:t xml:space="preserve">既存手法と比較して</w:t>
+        </w:r>
+      </w:ins>
+      <w:ins w:id="315" w:author="学生E" w:date="2026-06-11T01:05:16.588Z">
+        <w:r>
+          <w:t xml:space="preserve">主観評価との</w:t>
+        </w:r>
+      </w:ins>
+      <w:ins w:id="316" w:author="学生E" w:date="2026-06-11T01:05:46.653Z">
+        <w:r>
+          <w:t xml:space="preserve">考えられる。</w:t>
+        </w:r>
+      </w:ins>
+      <w:ins w:id="317" w:author="学生E" w:date="2026-06-11T01:06:58.574Z">
+        <w:r>
+          <w:t xml:space="preserve">重要だと考えられる。</w:t>
+        </w:r>
+      </w:ins>
+      <w:ins w:id="318" w:author="学生E" w:date="2026-06-11T01:07:58.208Z">
+        <w:r>
+          <w:t xml:space="preserve">主観評価との</w:t>
+        </w:r>
+      </w:ins>
+      <w:ins w:id="319" w:author="学生E" w:date="2026-06-11T01:09:08.431Z">
+        <w:r>
+          <w:t xml:space="preserve">評価者による</w:t>
+        </w:r>
+      </w:ins>
+      <w:del w:id="320" w:author="学生E" w:date="2026-06-11T01:09:13.431Z">
+        <w:r>
+          <w:delText xml:space="preserve"/>
+        </w:r>
+      </w:del>
+      <w:ins w:id="321" w:author="学生E" w:date="2026-06-11T01:09:39.426Z">
+        <w:r>
+          <w:t xml:space="preserve">また、</w:t>
+        </w:r>
+      </w:ins>
+      <w:ins w:id="322" w:author="学生E" w:date="2026-06-11T01:10:24.661Z">
+        <w:r>
+          <w:t xml:space="preserve">また、</w:t>
+        </w:r>
+      </w:ins>
+      <w:ins w:id="323" w:author="学生E" w:date="2026-06-11T01:10:52.593Z">
+        <w:r>
+          <w:t xml:space="preserve">重要だと考えられる。</w:t>
+        </w:r>
+      </w:ins>
+      <w:ins w:id="324" w:author="学生E" w:date="2026-06-11T01:12:05.588Z">
+        <w:r>
+          <w:t xml:space="preserve">提案手法は</w:t>
+        </w:r>
+      </w:ins>
+      <w:del w:id="325" w:author="学生E" w:date="2026-06-11T01:12:10.588Z">
+        <w:r>
+          <w:delText xml:space="preserve"/>
+        </w:r>
+      </w:del>
+      <w:ins w:id="326" w:author="学生E" w:date="2026-06-11T01:12:50.006Z">
+        <w:r>
+          <w:t xml:space="preserve">また、</w:t>
+        </w:r>
+      </w:ins>
+      <w:ins w:id="327" w:author="学生E" w:date="2026-06-11T01:13:33.263Z">
+        <w:r>
+          <w:t xml:space="preserve">重要だと考えられる。</w:t>
+        </w:r>
+      </w:ins>
+      <w:ins w:id="328" w:author="学生E" w:date="2026-06-11T01:14:07.493Z">
+        <w:r>
+          <w:t xml:space="preserve">今後の課題として</w:t>
+        </w:r>
+      </w:ins>
+      <w:ins w:id="329" w:author="学生E" w:date="2026-06-11T01:14:39.949Z">
+        <w:r>
+          <w:t xml:space="preserve">実験の結果</w:t>
+        </w:r>
+      </w:ins>
+      <w:ins w:id="330" w:author="学生E" w:date="2026-06-11T01:15:09.627Z">
+        <w:r>
+          <w:t xml:space="preserve">従来手法の</w:t>
+        </w:r>
+      </w:ins>
+      <w:ins w:id="331" w:author="学生E" w:date="2026-06-11T01:15:33.014Z">
+        <w:r>
+          <w:t xml:space="preserve">主観評価との</w:t>
+        </w:r>
+      </w:ins>
+      <w:ins w:id="332" w:author="学生E" w:date="2026-06-11T01:16:23.509Z">
+        <w:r>
+          <w:t xml:space="preserve">既存手法と比較して</w:t>
+        </w:r>
+      </w:ins>
+      <w:ins w:id="333" w:author="学生E" w:date="2026-06-11T01:17:24.384Z">
+        <w:r>
+          <w:t xml:space="preserve">定量的に測ることが</w:t>
+        </w:r>
+      </w:ins>
+      <w:ins w:id="334" w:author="学生E" w:date="2026-06-11T01:18:38.094Z">
+        <w:r>
+          <w:t xml:space="preserve">考えられる。</w:t>
+        </w:r>
+      </w:ins>
+      <w:ins w:id="335" w:author="学生E" w:date="2026-06-11T01:18:56.353Z">
+        <w:r>
+          <w:t xml:space="preserve">本研究では</w:t>
+        </w:r>
+      </w:ins>
+      <w:ins w:id="336" w:author="学生E" w:date="2026-06-11T01:19:40.837Z">
+        <w:r>
+          <w:t xml:space="preserve">提案する。</w:t>
+        </w:r>
+      </w:ins>
+      <w:ins w:id="337" w:author="学生E" w:date="2026-06-11T01:20:33.266Z">
+        <w:r>
+          <w:t xml:space="preserve">本研究では</w:t>
+        </w:r>
+      </w:ins>
+      <w:ins w:id="338" w:author="学生E" w:date="2026-06-11T01:21:01.039Z">
+        <w:r>
+          <w:t xml:space="preserve">評価者による</w:t>
+        </w:r>
+      </w:ins>
+      <w:ins w:id="339" w:author="学生E" w:date="2026-06-11T01:21:57.624Z">
+        <w:r>
+          <w:t xml:space="preserve">従来手法の</w:t>
         </w:r>
       </w:ins>
     </w:p>

</xml_diff>